<commit_message>
Checkpoint 08:01_19/06/26 saved at 2026-06-19_08-01-27
</commit_message>
<xml_diff>
--- a/backend/templates/BOQ/template.docx
+++ b/backend/templates/BOQ/template.docx
@@ -2,6 +2,103 @@
 <file path=word/document.xml><?xml version="1.0" encoding="utf-8"?>
 <w:document xmlns:wpc="http://schemas.microsoft.com/office/word/2010/wordprocessingCanvas" xmlns:cx="http://schemas.microsoft.com/office/drawing/2014/chartex" xmlns:cx1="http://schemas.microsoft.com/office/drawing/2015/9/8/chartex" xmlns:cx2="http://schemas.microsoft.com/office/drawing/2015/10/21/chartex" xmlns:cx3="http://schemas.microsoft.com/office/drawing/2016/5/9/chartex" xmlns:cx4="http://schemas.microsoft.com/office/drawing/2016/5/10/chartex" xmlns:cx5="http://schemas.microsoft.com/office/drawing/2016/5/11/chartex" xmlns:cx6="http://schemas.microsoft.com/office/drawing/2016/5/12/chartex" xmlns:cx7="http://schemas.microsoft.com/office/drawing/2016/5/13/chartex" xmlns:cx8="http://schemas.microsoft.com/office/drawing/2016/5/14/chartex" xmlns:mc="http://schemas.openxmlformats.org/markup-compatibility/2006" xmlns:aink="http://schemas.microsoft.com/office/drawing/2016/ink" xmlns:am3d="http://schemas.microsoft.com/office/drawing/2017/model3d" xmlns:o="urn:schemas-microsoft-com:office:office" xmlns:oel="http://schemas.microsoft.com/office/2019/extlst" xmlns:r="http://schemas.openxmlformats.org/officeDocument/2006/relationships" xmlns:m="http://schemas.openxmlformats.org/officeDocument/2006/math" xmlns:v="urn:schemas-microsoft-com:vml" xmlns:wp14="http://schemas.microsoft.com/office/word/2010/wordprocessingDrawing" xmlns:wp="http://schemas.openxmlformats.org/drawingml/2006/wordprocessingDrawing" xmlns:w10="urn:schemas-microsoft-com:office:word" xmlns:w="http://schemas.openxmlformats.org/wordprocessingml/2006/main" xmlns:w14="http://schemas.microsoft.com/office/word/2010/wordml" xmlns:w15="http://schemas.microsoft.com/office/word/2012/wordml" xmlns:w16cex="http://schemas.microsoft.com/office/word/2018/wordml/cex" xmlns:w16cid="http://schemas.microsoft.com/office/word/2016/wordml/cid" xmlns:w16="http://schemas.microsoft.com/office/word/2018/wordml" xmlns:w16du="http://schemas.microsoft.com/office/word/2023/wordml/word16du" xmlns:w16sdtdh="http://schemas.microsoft.com/office/word/2020/wordml/sdtdatahash" xmlns:w16sdtfl="http://schemas.microsoft.com/office/word/2024/wordml/sdtformatlock" xmlns:w16se="http://schemas.microsoft.com/office/word/2015/wordml/symex" xmlns:wpg="http://schemas.microsoft.com/office/word/2010/wordprocessingGroup" xmlns:wpi="http://schemas.microsoft.com/office/word/2010/wordprocessingInk" xmlns:wne="http://schemas.microsoft.com/office/word/2006/wordml" xmlns:wps="http://schemas.microsoft.com/office/word/2010/wordprocessingShape" mc:Ignorable="w14 w15 w16se w16cid w16 w16cex w16sdtdh w16sdtfl w16du wp14">
   <w:body>
+    <w:p>
+      <w:pPr>
+        <w:rPr>
+          <w:rFonts w:ascii="TT Norms Regular" w:hAnsi="TT Norms Regular"/>
+          <w:b/>
+          <w:bCs/>
+          <w:sz w:val="28"/>
+          <w:szCs w:val="28"/>
+        </w:rPr>
+      </w:pPr>
+      <w:r>
+        <w:rPr>
+          <w:rFonts w:ascii="TT Norms Regular" w:hAnsi="TT Norms Regular"/>
+          <w:b/>
+          <w:bCs/>
+          <w:sz w:val="28"/>
+          <w:szCs w:val="28"/>
+        </w:rPr>
+        <w:t>{{#floor</w:t>
+      </w:r>
+      <w:proofErr w:type="gramStart"/>
+      <w:r>
+        <w:rPr>
+          <w:rFonts w:ascii="TT Norms Regular" w:hAnsi="TT Norms Regular"/>
+          <w:b/>
+          <w:bCs/>
+          <w:sz w:val="28"/>
+          <w:szCs w:val="28"/>
+        </w:rPr>
+        <w:t>}}</w:t>
+      </w:r>
+      <w:r>
+        <w:rPr>
+          <w:rFonts w:ascii="TT Norms Regular" w:hAnsi="TT Norms Regular"/>
+          <w:b/>
+          <w:bCs/>
+          <w:sz w:val="28"/>
+          <w:szCs w:val="28"/>
+        </w:rPr>
+        <w:t>{</w:t>
+      </w:r>
+      <w:proofErr w:type="gramEnd"/>
+      <w:r>
+        <w:rPr>
+          <w:rFonts w:ascii="TT Norms Regular" w:hAnsi="TT Norms Regular"/>
+          <w:b/>
+          <w:bCs/>
+          <w:sz w:val="28"/>
+          <w:szCs w:val="28"/>
+        </w:rPr>
+        <w:t>{floor.name}}</w:t>
+      </w:r>
+    </w:p>
+    <w:p>
+      <w:pPr>
+        <w:rPr>
+          <w:rFonts w:ascii="TT Norms Regular" w:hAnsi="TT Norms Regular"/>
+          <w:b/>
+          <w:bCs/>
+          <w:lang w:val="en-ZA"/>
+        </w:rPr>
+      </w:pPr>
+      <w:r>
+        <w:rPr>
+          <w:rFonts w:ascii="TT Norms Regular" w:hAnsi="TT Norms Regular"/>
+          <w:b/>
+          <w:bCs/>
+        </w:rPr>
+        <w:t>{{#area</w:t>
+      </w:r>
+      <w:proofErr w:type="gramStart"/>
+      <w:r>
+        <w:rPr>
+          <w:rFonts w:ascii="TT Norms Regular" w:hAnsi="TT Norms Regular"/>
+          <w:b/>
+          <w:bCs/>
+        </w:rPr>
+        <w:t>}}</w:t>
+      </w:r>
+      <w:r>
+        <w:rPr>
+          <w:rFonts w:ascii="TT Norms Regular" w:hAnsi="TT Norms Regular"/>
+          <w:b/>
+          <w:bCs/>
+        </w:rPr>
+        <w:t>{</w:t>
+      </w:r>
+      <w:proofErr w:type="gramEnd"/>
+      <w:r>
+        <w:rPr>
+          <w:rFonts w:ascii="TT Norms Regular" w:hAnsi="TT Norms Regular"/>
+          <w:b/>
+          <w:bCs/>
+        </w:rPr>
+        <w:t>{area.name}}</w:t>
+      </w:r>
+    </w:p>
     <w:tbl>
       <w:tblPr>
         <w:tblStyle w:val="LightList"/>
@@ -10,13 +107,12 @@
         <w:tblLook w:val="0620" w:firstRow="1" w:lastRow="0" w:firstColumn="0" w:lastColumn="0" w:noHBand="1" w:noVBand="1"/>
       </w:tblPr>
       <w:tblGrid>
-        <w:gridCol w:w="1216"/>
-        <w:gridCol w:w="1375"/>
-        <w:gridCol w:w="1919"/>
-        <w:gridCol w:w="1338"/>
-        <w:gridCol w:w="1314"/>
-        <w:gridCol w:w="1694"/>
-        <w:gridCol w:w="2466"/>
+        <w:gridCol w:w="1445"/>
+        <w:gridCol w:w="1633"/>
+        <w:gridCol w:w="2282"/>
+        <w:gridCol w:w="1442"/>
+        <w:gridCol w:w="2014"/>
+        <w:gridCol w:w="2506"/>
       </w:tblGrid>
       <w:tr>
         <w:trPr>
@@ -138,42 +234,13 @@
                 <w:rFonts w:ascii="TT Norms Regular" w:hAnsi="TT Norms Regular"/>
                 <w:szCs w:val="20"/>
               </w:rPr>
-              <w:t>Floor</w:t>
+              <w:t>ETA</w:t>
             </w:r>
           </w:p>
         </w:tc>
         <w:tc>
           <w:tcPr>
-            <w:tcW w:w="822" w:type="dxa"/>
-            <w:tcBorders>
-              <w:top w:val="single" w:sz="12" w:space="0" w:color="auto"/>
-              <w:left w:val="single" w:sz="4" w:space="0" w:color="auto"/>
-              <w:bottom w:val="single" w:sz="4" w:space="0" w:color="auto"/>
-              <w:right w:val="single" w:sz="4" w:space="0" w:color="auto"/>
-            </w:tcBorders>
-          </w:tcPr>
-          <w:p>
-            <w:pPr>
-              <w:tabs>
-                <w:tab w:val="left" w:pos="1620"/>
-              </w:tabs>
-              <w:rPr>
-                <w:rFonts w:ascii="TT Norms Regular" w:hAnsi="TT Norms Regular"/>
-                <w:szCs w:val="20"/>
-              </w:rPr>
-            </w:pPr>
-            <w:r>
-              <w:rPr>
-                <w:rFonts w:ascii="TT Norms Regular" w:hAnsi="TT Norms Regular"/>
-                <w:szCs w:val="20"/>
-              </w:rPr>
-              <w:t>Area</w:t>
-            </w:r>
-          </w:p>
-        </w:tc>
-        <w:tc>
-          <w:tcPr>
-            <w:tcW w:w="2053" w:type="dxa"/>
+            <w:tcW w:w="0" w:type="auto"/>
             <w:tcBorders>
               <w:top w:val="single" w:sz="12" w:space="0" w:color="auto"/>
               <w:left w:val="single" w:sz="4" w:space="0" w:color="auto"/>
@@ -202,7 +269,7 @@
         </w:tc>
         <w:tc>
           <w:tcPr>
-            <w:tcW w:w="2547" w:type="dxa"/>
+            <w:tcW w:w="0" w:type="auto"/>
             <w:tcBorders>
               <w:top w:val="single" w:sz="12" w:space="0" w:color="auto"/>
               <w:left w:val="single" w:sz="4" w:space="0" w:color="auto"/>
@@ -256,7 +323,23 @@
                 <w:rFonts w:ascii="TT Norms Regular" w:hAnsi="TT Norms Regular"/>
                 <w:szCs w:val="20"/>
               </w:rPr>
-              <w:t>{{item.qty}}</w:t>
+              <w:t>{{</w:t>
+            </w:r>
+            <w:proofErr w:type="spellStart"/>
+            <w:r>
+              <w:rPr>
+                <w:rFonts w:ascii="TT Norms Regular" w:hAnsi="TT Norms Regular"/>
+                <w:szCs w:val="20"/>
+              </w:rPr>
+              <w:t>item.qty</w:t>
+            </w:r>
+            <w:proofErr w:type="spellEnd"/>
+            <w:r>
+              <w:rPr>
+                <w:rFonts w:ascii="TT Norms Regular" w:hAnsi="TT Norms Regular"/>
+                <w:szCs w:val="20"/>
+              </w:rPr>
+              <w:t>}}</w:t>
             </w:r>
           </w:p>
         </w:tc>
@@ -282,7 +365,25 @@
                 <w:rFonts w:ascii="TT Norms Regular" w:hAnsi="TT Norms Regular"/>
                 <w:szCs w:val="20"/>
               </w:rPr>
-              <w:t>{{item.code}}</w:t>
+              <w:t>{{</w:t>
+            </w:r>
+            <w:proofErr w:type="spellStart"/>
+            <w:proofErr w:type="gramStart"/>
+            <w:r>
+              <w:rPr>
+                <w:rFonts w:ascii="TT Norms Regular" w:hAnsi="TT Norms Regular"/>
+                <w:szCs w:val="20"/>
+              </w:rPr>
+              <w:t>item.code</w:t>
+            </w:r>
+            <w:proofErr w:type="spellEnd"/>
+            <w:proofErr w:type="gramEnd"/>
+            <w:r>
+              <w:rPr>
+                <w:rFonts w:ascii="TT Norms Regular" w:hAnsi="TT Norms Regular"/>
+                <w:szCs w:val="20"/>
+              </w:rPr>
+              <w:t>}}</w:t>
             </w:r>
           </w:p>
         </w:tc>
@@ -308,7 +409,25 @@
                 <w:rFonts w:ascii="TT Norms Regular" w:hAnsi="TT Norms Regular"/>
                 <w:szCs w:val="20"/>
               </w:rPr>
-              <w:t>{{item.description}}</w:t>
+              <w:t>{{</w:t>
+            </w:r>
+            <w:proofErr w:type="spellStart"/>
+            <w:proofErr w:type="gramStart"/>
+            <w:r>
+              <w:rPr>
+                <w:rFonts w:ascii="TT Norms Regular" w:hAnsi="TT Norms Regular"/>
+                <w:szCs w:val="20"/>
+              </w:rPr>
+              <w:t>item.description</w:t>
+            </w:r>
+            <w:proofErr w:type="spellEnd"/>
+            <w:proofErr w:type="gramEnd"/>
+            <w:r>
+              <w:rPr>
+                <w:rFonts w:ascii="TT Norms Regular" w:hAnsi="TT Norms Regular"/>
+                <w:szCs w:val="20"/>
+              </w:rPr>
+              <w:t>}}</w:t>
             </w:r>
           </w:p>
         </w:tc>
@@ -334,13 +453,29 @@
                 <w:rFonts w:ascii="TT Norms Regular" w:hAnsi="TT Norms Regular"/>
                 <w:szCs w:val="20"/>
               </w:rPr>
-              <w:t>{{item.floor}}</w:t>
+              <w:t>{{</w:t>
+            </w:r>
+            <w:proofErr w:type="spellStart"/>
+            <w:r>
+              <w:rPr>
+                <w:rFonts w:ascii="TT Norms Regular" w:hAnsi="TT Norms Regular"/>
+                <w:szCs w:val="20"/>
+              </w:rPr>
+              <w:t>item.eta</w:t>
+            </w:r>
+            <w:proofErr w:type="spellEnd"/>
+            <w:r>
+              <w:rPr>
+                <w:rFonts w:ascii="TT Norms Regular" w:hAnsi="TT Norms Regular"/>
+                <w:szCs w:val="20"/>
+              </w:rPr>
+              <w:t>}}</w:t>
             </w:r>
           </w:p>
         </w:tc>
         <w:tc>
           <w:tcPr>
-            <w:tcW w:w="822" w:type="dxa"/>
+            <w:tcW w:w="0" w:type="auto"/>
             <w:tcBorders>
               <w:top w:val="single" w:sz="4" w:space="0" w:color="auto"/>
               <w:left w:val="single" w:sz="4" w:space="0" w:color="auto"/>
@@ -360,39 +495,31 @@
                 <w:rFonts w:ascii="TT Norms Regular" w:hAnsi="TT Norms Regular"/>
                 <w:szCs w:val="20"/>
               </w:rPr>
-              <w:t>{{item.area}}</w:t>
+              <w:t>{{</w:t>
+            </w:r>
+            <w:proofErr w:type="spellStart"/>
+            <w:proofErr w:type="gramStart"/>
+            <w:r>
+              <w:rPr>
+                <w:rFonts w:ascii="TT Norms Regular" w:hAnsi="TT Norms Regular"/>
+                <w:szCs w:val="20"/>
+              </w:rPr>
+              <w:t>item.unitCost</w:t>
+            </w:r>
+            <w:proofErr w:type="spellEnd"/>
+            <w:proofErr w:type="gramEnd"/>
+            <w:r>
+              <w:rPr>
+                <w:rFonts w:ascii="TT Norms Regular" w:hAnsi="TT Norms Regular"/>
+                <w:szCs w:val="20"/>
+              </w:rPr>
+              <w:t>}}</w:t>
             </w:r>
           </w:p>
         </w:tc>
         <w:tc>
           <w:tcPr>
-            <w:tcW w:w="2053" w:type="dxa"/>
-            <w:tcBorders>
-              <w:top w:val="single" w:sz="4" w:space="0" w:color="auto"/>
-              <w:left w:val="single" w:sz="4" w:space="0" w:color="auto"/>
-              <w:bottom w:val="single" w:sz="4" w:space="0" w:color="auto"/>
-              <w:right w:val="single" w:sz="4" w:space="0" w:color="auto"/>
-            </w:tcBorders>
-          </w:tcPr>
-          <w:p>
-            <w:pPr>
-              <w:rPr>
-                <w:rFonts w:ascii="TT Norms Regular" w:hAnsi="TT Norms Regular"/>
-                <w:szCs w:val="20"/>
-              </w:rPr>
-            </w:pPr>
-            <w:r>
-              <w:rPr>
-                <w:rFonts w:ascii="TT Norms Regular" w:hAnsi="TT Norms Regular"/>
-                <w:szCs w:val="20"/>
-              </w:rPr>
-              <w:t>{{item.unitCost}}</w:t>
-            </w:r>
-          </w:p>
-        </w:tc>
-        <w:tc>
-          <w:tcPr>
-            <w:tcW w:w="2547" w:type="dxa"/>
+            <w:tcW w:w="0" w:type="auto"/>
             <w:tcBorders>
               <w:top w:val="single" w:sz="4" w:space="0" w:color="auto"/>
               <w:left w:val="single" w:sz="4" w:space="0" w:color="auto"/>
@@ -412,7 +539,25 @@
                 <w:rFonts w:ascii="TT Norms Regular" w:hAnsi="TT Norms Regular"/>
                 <w:szCs w:val="20"/>
               </w:rPr>
-              <w:t>{{item.totalRetail}}</w:t>
+              <w:t>{{</w:t>
+            </w:r>
+            <w:proofErr w:type="spellStart"/>
+            <w:proofErr w:type="gramStart"/>
+            <w:r>
+              <w:rPr>
+                <w:rFonts w:ascii="TT Norms Regular" w:hAnsi="TT Norms Regular"/>
+                <w:szCs w:val="20"/>
+              </w:rPr>
+              <w:t>item.totalRetail</w:t>
+            </w:r>
+            <w:proofErr w:type="spellEnd"/>
+            <w:proofErr w:type="gramEnd"/>
+            <w:r>
+              <w:rPr>
+                <w:rFonts w:ascii="TT Norms Regular" w:hAnsi="TT Norms Regular"/>
+                <w:szCs w:val="20"/>
+              </w:rPr>
+              <w:t>}}</w:t>
             </w:r>
           </w:p>
         </w:tc>
@@ -499,7 +644,7 @@
         </w:tc>
         <w:tc>
           <w:tcPr>
-            <w:tcW w:w="822" w:type="dxa"/>
+            <w:tcW w:w="0" w:type="auto"/>
             <w:tcBorders>
               <w:top w:val="single" w:sz="4" w:space="0" w:color="auto"/>
               <w:left w:val="single" w:sz="4" w:space="0" w:color="auto"/>
@@ -518,26 +663,7 @@
         </w:tc>
         <w:tc>
           <w:tcPr>
-            <w:tcW w:w="2053" w:type="dxa"/>
-            <w:tcBorders>
-              <w:top w:val="single" w:sz="4" w:space="0" w:color="auto"/>
-              <w:left w:val="single" w:sz="4" w:space="0" w:color="auto"/>
-              <w:bottom w:val="single" w:sz="12" w:space="0" w:color="auto"/>
-              <w:right w:val="single" w:sz="4" w:space="0" w:color="auto"/>
-            </w:tcBorders>
-          </w:tcPr>
-          <w:p>
-            <w:pPr>
-              <w:rPr>
-                <w:rFonts w:ascii="TT Norms Regular" w:hAnsi="TT Norms Regular"/>
-                <w:szCs w:val="20"/>
-              </w:rPr>
-            </w:pPr>
-          </w:p>
-        </w:tc>
-        <w:tc>
-          <w:tcPr>
-            <w:tcW w:w="2547" w:type="dxa"/>
+            <w:tcW w:w="0" w:type="auto"/>
             <w:tcBorders>
               <w:top w:val="single" w:sz="4" w:space="0" w:color="auto"/>
               <w:left w:val="single" w:sz="4" w:space="0" w:color="auto"/>
@@ -561,8 +687,8 @@
         </w:trPr>
         <w:tc>
           <w:tcPr>
-            <w:tcW w:w="8775" w:type="dxa"/>
-            <w:gridSpan w:val="6"/>
+            <w:tcW w:w="8816" w:type="dxa"/>
+            <w:gridSpan w:val="5"/>
             <w:tcBorders>
               <w:top w:val="single" w:sz="12" w:space="0" w:color="auto"/>
               <w:left w:val="single" w:sz="12" w:space="0" w:color="auto"/>
@@ -589,7 +715,7 @@
         </w:tc>
         <w:tc>
           <w:tcPr>
-            <w:tcW w:w="2547" w:type="dxa"/>
+            <w:tcW w:w="2506" w:type="dxa"/>
             <w:tcBorders>
               <w:top w:val="single" w:sz="12" w:space="0" w:color="auto"/>
               <w:left w:val="single" w:sz="4" w:space="0" w:color="auto"/>
@@ -614,14 +740,53 @@
           </w:p>
         </w:tc>
       </w:tr>
+    </w:tbl>
+    <w:p>
+      <w:pPr>
+        <w:rPr>
+          <w:lang w:val="en-ZA"/>
+        </w:rPr>
+      </w:pPr>
+      <w:r>
+        <w:rPr>
+          <w:lang w:val="en-ZA"/>
+        </w:rPr>
+        <w:t>{{/area</w:t>
+      </w:r>
+      <w:proofErr w:type="gramStart"/>
+      <w:r>
+        <w:rPr>
+          <w:lang w:val="en-ZA"/>
+        </w:rPr>
+        <w:t>}}</w:t>
+      </w:r>
+      <w:r>
+        <w:t>{</w:t>
+      </w:r>
+      <w:proofErr w:type="gramEnd"/>
+      <w:r>
+        <w:t>{/floor}}</w:t>
+      </w:r>
+    </w:p>
+    <w:tbl>
+      <w:tblPr>
+        <w:tblStyle w:val="LightList"/>
+        <w:tblpPr w:leftFromText="180" w:rightFromText="180" w:vertAnchor="text" w:horzAnchor="margin" w:tblpXSpec="center" w:tblpY="81"/>
+        <w:tblW w:w="11322" w:type="dxa"/>
+        <w:tblLook w:val="0620" w:firstRow="1" w:lastRow="0" w:firstColumn="0" w:lastColumn="0" w:noHBand="1" w:noVBand="1"/>
+      </w:tblPr>
+      <w:tblGrid>
+        <w:gridCol w:w="8761"/>
+        <w:gridCol w:w="2561"/>
+      </w:tblGrid>
       <w:tr>
         <w:trPr>
+          <w:cnfStyle w:val="100000000000" w:firstRow="1" w:lastRow="0" w:firstColumn="0" w:lastColumn="0" w:oddVBand="0" w:evenVBand="0" w:oddHBand="0" w:evenHBand="0" w:firstRowFirstColumn="0" w:firstRowLastColumn="0" w:lastRowFirstColumn="0" w:lastRowLastColumn="0"/>
           <w:trHeight w:val="319"/>
         </w:trPr>
         <w:tc>
           <w:tcPr>
-            <w:tcW w:w="8775" w:type="dxa"/>
-            <w:gridSpan w:val="6"/>
+            <w:tcW w:w="8816" w:type="dxa"/>
             <w:tcBorders>
               <w:top w:val="single" w:sz="4" w:space="0" w:color="auto"/>
               <w:left w:val="single" w:sz="12" w:space="0" w:color="auto"/>
@@ -642,20 +807,13 @@
                 <w:rFonts w:ascii="TT Norms Regular" w:hAnsi="TT Norms Regular"/>
                 <w:szCs w:val="20"/>
               </w:rPr>
-              <w:t>DISCOUNT</w:t>
-            </w:r>
-            <w:r>
-              <w:rPr>
-                <w:rFonts w:ascii="TT Norms Regular" w:hAnsi="TT Norms Regular"/>
-                <w:szCs w:val="20"/>
-              </w:rPr>
-              <w:t>:</w:t>
+              <w:t>DISCOUNT:</w:t>
             </w:r>
           </w:p>
         </w:tc>
         <w:tc>
           <w:tcPr>
-            <w:tcW w:w="2547" w:type="dxa"/>
+            <w:tcW w:w="2506" w:type="dxa"/>
             <w:tcBorders>
               <w:top w:val="single" w:sz="4" w:space="0" w:color="auto"/>
               <w:left w:val="single" w:sz="4" w:space="0" w:color="auto"/>
@@ -685,8 +843,7 @@
         </w:trPr>
         <w:tc>
           <w:tcPr>
-            <w:tcW w:w="8775" w:type="dxa"/>
-            <w:gridSpan w:val="6"/>
+            <w:tcW w:w="8816" w:type="dxa"/>
             <w:tcBorders>
               <w:top w:val="single" w:sz="4" w:space="0" w:color="auto"/>
               <w:left w:val="single" w:sz="12" w:space="0" w:color="auto"/>
@@ -713,7 +870,7 @@
         </w:tc>
         <w:tc>
           <w:tcPr>
-            <w:tcW w:w="2547" w:type="dxa"/>
+            <w:tcW w:w="2506" w:type="dxa"/>
             <w:tcBorders>
               <w:top w:val="single" w:sz="4" w:space="0" w:color="auto"/>
               <w:left w:val="single" w:sz="4" w:space="0" w:color="auto"/>
@@ -744,8 +901,7 @@
         </w:trPr>
         <w:tc>
           <w:tcPr>
-            <w:tcW w:w="8775" w:type="dxa"/>
-            <w:gridSpan w:val="6"/>
+            <w:tcW w:w="8816" w:type="dxa"/>
             <w:tcBorders>
               <w:top w:val="single" w:sz="4" w:space="0" w:color="auto"/>
               <w:left w:val="single" w:sz="12" w:space="0" w:color="auto"/>
@@ -785,7 +941,7 @@
         </w:tc>
         <w:tc>
           <w:tcPr>
-            <w:tcW w:w="2547" w:type="dxa"/>
+            <w:tcW w:w="2506" w:type="dxa"/>
             <w:tcBorders>
               <w:top w:val="single" w:sz="4" w:space="0" w:color="auto"/>
               <w:left w:val="single" w:sz="4" w:space="0" w:color="auto"/>
@@ -816,8 +972,7 @@
         </w:trPr>
         <w:tc>
           <w:tcPr>
-            <w:tcW w:w="8775" w:type="dxa"/>
-            <w:gridSpan w:val="6"/>
+            <w:tcW w:w="8816" w:type="dxa"/>
             <w:tcBorders>
               <w:top w:val="single" w:sz="12" w:space="0" w:color="auto"/>
               <w:left w:val="single" w:sz="12" w:space="0" w:color="auto"/>
@@ -859,7 +1014,7 @@
         </w:tc>
         <w:tc>
           <w:tcPr>
-            <w:tcW w:w="2547" w:type="dxa"/>
+            <w:tcW w:w="2506" w:type="dxa"/>
             <w:tcBorders>
               <w:top w:val="single" w:sz="12" w:space="0" w:color="auto"/>
               <w:left w:val="single" w:sz="4" w:space="0" w:color="auto"/>
@@ -879,183 +1034,7 @@
                 <w:rFonts w:ascii="TT Norms Regular" w:hAnsi="TT Norms Regular"/>
                 <w:szCs w:val="20"/>
               </w:rPr>
-              <w:t>{{</w:t>
-            </w:r>
-            <w:r>
-              <w:rPr>
-                <w:rFonts w:ascii="TT Norms Regular" w:hAnsi="TT Norms Regular"/>
-                <w:szCs w:val="20"/>
-              </w:rPr>
-              <w:t>DEPOSIT</w:t>
-            </w:r>
-            <w:r>
-              <w:rPr>
-                <w:rFonts w:ascii="TT Norms Regular" w:hAnsi="TT Norms Regular"/>
-                <w:szCs w:val="20"/>
-              </w:rPr>
-              <w:t>}}</w:t>
-            </w:r>
-          </w:p>
-        </w:tc>
-      </w:tr>
-    </w:tbl>
-    <w:p>
-      <w:pPr>
-        <w:pStyle w:val="ListBullet"/>
-        <w:numPr>
-          <w:ilvl w:val="0"/>
-          <w:numId w:val="0"/>
-        </w:numPr>
-        <w:rPr>
-          <w:rFonts w:ascii="TT Norms Regular" w:hAnsi="TT Norms Regular"/>
-        </w:rPr>
-      </w:pPr>
-    </w:p>
-    <w:tbl>
-      <w:tblPr>
-        <w:tblStyle w:val="TableGrid"/>
-        <w:tblW w:w="0" w:type="auto"/>
-        <w:tblBorders>
-          <w:top w:val="single" w:sz="12" w:space="0" w:color="auto"/>
-          <w:left w:val="single" w:sz="12" w:space="0" w:color="auto"/>
-          <w:bottom w:val="single" w:sz="12" w:space="0" w:color="auto"/>
-          <w:right w:val="single" w:sz="12" w:space="0" w:color="auto"/>
-          <w:insideH w:val="single" w:sz="12" w:space="0" w:color="auto"/>
-          <w:insideV w:val="single" w:sz="12" w:space="0" w:color="auto"/>
-        </w:tblBorders>
-        <w:tblLook w:val="04A0" w:firstRow="1" w:lastRow="0" w:firstColumn="1" w:lastColumn="0" w:noHBand="0" w:noVBand="1"/>
-      </w:tblPr>
-      <w:tblGrid>
-        <w:gridCol w:w="3774"/>
-        <w:gridCol w:w="3774"/>
-        <w:gridCol w:w="3774"/>
-      </w:tblGrid>
-      <w:tr>
-        <w:tc>
-          <w:tcPr>
-            <w:tcW w:w="11322" w:type="dxa"/>
-            <w:gridSpan w:val="3"/>
-          </w:tcPr>
-          <w:p>
-            <w:pPr>
-              <w:pStyle w:val="ListBullet"/>
-              <w:numPr>
-                <w:ilvl w:val="0"/>
-                <w:numId w:val="0"/>
-              </w:numPr>
-              <w:jc w:val="center"/>
-              <w:rPr>
-                <w:rFonts w:ascii="TT Norms Regular" w:hAnsi="TT Norms Regular"/>
-                <w:b/>
-                <w:bCs/>
-                <w:sz w:val="32"/>
-                <w:szCs w:val="32"/>
-              </w:rPr>
-            </w:pPr>
-            <w:r>
-              <w:rPr>
-                <w:rFonts w:ascii="TT Norms Regular" w:hAnsi="TT Norms Regular"/>
-                <w:b/>
-                <w:bCs/>
-                <w:sz w:val="32"/>
-                <w:szCs w:val="32"/>
-              </w:rPr>
-              <w:t>Approval of this Bill of Quantities (BOQ)</w:t>
-            </w:r>
-          </w:p>
-        </w:tc>
-      </w:tr>
-      <w:tr>
-        <w:trPr>
-          <w:trHeight w:val="539"/>
-        </w:trPr>
-        <w:tc>
-          <w:tcPr>
-            <w:tcW w:w="3774" w:type="dxa"/>
-            <w:vAlign w:val="center"/>
-          </w:tcPr>
-          <w:p>
-            <w:pPr>
-              <w:pStyle w:val="ListBullet"/>
-              <w:numPr>
-                <w:ilvl w:val="0"/>
-                <w:numId w:val="0"/>
-              </w:numPr>
-              <w:rPr>
-                <w:rFonts w:ascii="TT Norms Regular" w:hAnsi="TT Norms Regular"/>
-              </w:rPr>
-            </w:pPr>
-            <w:r>
-              <w:rPr>
-                <w:rFonts w:ascii="TT Norms Regular" w:hAnsi="TT Norms Regular"/>
-              </w:rPr>
-              <w:t>Signiture:</w:t>
-            </w:r>
-            <w:r>
-              <w:rPr>
-                <w:rFonts w:ascii="TT Norms Regular" w:hAnsi="TT Norms Regular"/>
-              </w:rPr>
-              <w:t xml:space="preserve"> </w:t>
-            </w:r>
-            <w:r>
-              <w:rPr>
-                <w:rFonts w:ascii="TT Norms Regular" w:hAnsi="TT Norms Regular"/>
-              </w:rPr>
-              <w:t>________________________________</w:t>
-            </w:r>
-          </w:p>
-        </w:tc>
-        <w:tc>
-          <w:tcPr>
-            <w:tcW w:w="3774" w:type="dxa"/>
-            <w:vAlign w:val="center"/>
-          </w:tcPr>
-          <w:p>
-            <w:pPr>
-              <w:pStyle w:val="ListBullet"/>
-              <w:numPr>
-                <w:ilvl w:val="0"/>
-                <w:numId w:val="0"/>
-              </w:numPr>
-              <w:rPr>
-                <w:rFonts w:ascii="TT Norms Regular" w:hAnsi="TT Norms Regular"/>
-              </w:rPr>
-            </w:pPr>
-            <w:r>
-              <w:rPr>
-                <w:rFonts w:ascii="TT Norms Regular" w:hAnsi="TT Norms Regular"/>
-              </w:rPr>
-              <w:t>Print Name:________________________________</w:t>
-            </w:r>
-          </w:p>
-        </w:tc>
-        <w:tc>
-          <w:tcPr>
-            <w:tcW w:w="3774" w:type="dxa"/>
-            <w:vAlign w:val="center"/>
-          </w:tcPr>
-          <w:p>
-            <w:pPr>
-              <w:pStyle w:val="ListBullet"/>
-              <w:numPr>
-                <w:ilvl w:val="0"/>
-                <w:numId w:val="0"/>
-              </w:numPr>
-              <w:rPr>
-                <w:rFonts w:ascii="TT Norms Regular" w:hAnsi="TT Norms Regular"/>
-              </w:rPr>
-            </w:pPr>
-            <w:r>
-              <w:rPr>
-                <w:rFonts w:ascii="TT Norms Regular" w:hAnsi="TT Norms Regular"/>
-              </w:rPr>
-              <w:t xml:space="preserve">Date: </w:t>
-            </w:r>
-            <w:r>
-              <w:rPr>
-                <w:rFonts w:ascii="TT Norms Regular" w:hAnsi="TT Norms Regular"/>
-              </w:rPr>
-              <w:t>________________________________</w:t>
+              <w:t>{{DEPOSIT}}</w:t>
             </w:r>
           </w:p>
         </w:tc>
@@ -1167,18 +1146,38 @@
         <w:sz w:val="16"/>
         <w:szCs w:val="16"/>
       </w:rPr>
-      <w:t>**This quote does not include the . If required, please inform the Project Manager and we will revise the quote accordingly.</w:t>
+      <w:t xml:space="preserve">**This quote does not include </w:t>
     </w:r>
-  </w:p>
-  <w:p>
-    <w:pPr>
-      <w:pStyle w:val="Footer"/>
+    <w:proofErr w:type="gramStart"/>
+    <w:r>
       <w:rPr>
         <w:rFonts w:ascii="TT Norms Regular" w:hAnsi="TT Norms Regular"/>
         <w:color w:val="EE0000"/>
         <w:sz w:val="16"/>
         <w:szCs w:val="16"/>
       </w:rPr>
+      <w:t>the .</w:t>
+    </w:r>
+    <w:proofErr w:type="gramEnd"/>
+    <w:r>
+      <w:rPr>
+        <w:rFonts w:ascii="TT Norms Regular" w:hAnsi="TT Norms Regular"/>
+        <w:color w:val="EE0000"/>
+        <w:sz w:val="16"/>
+        <w:szCs w:val="16"/>
+      </w:rPr>
+      <w:t xml:space="preserve"> If required, please inform the Project Manager and we will revise the quote accordingly.</w:t>
+    </w:r>
+  </w:p>
+  <w:p>
+    <w:pPr>
+      <w:pStyle w:val="Footer"/>
+      <w:rPr>
+        <w:rFonts w:ascii="TT Norms Regular" w:hAnsi="TT Norms Regular"/>
+        <w:color w:val="EE0000"/>
+        <w:sz w:val="16"/>
+        <w:szCs w:val="16"/>
+      </w:rPr>
     </w:pPr>
   </w:p>
   <w:p>
@@ -1243,7 +1242,43 @@
         <w:sz w:val="16"/>
         <w:szCs w:val="16"/>
       </w:rPr>
-      <w:t>1TO1 Design Studio - 7 Ravenscraig Road, Woodstock ,Unit 116 Masons Press Building</w:t>
+      <w:t xml:space="preserve">1TO1 Design Studio - 7 </w:t>
+    </w:r>
+    <w:proofErr w:type="spellStart"/>
+    <w:r>
+      <w:rPr>
+        <w:rFonts w:ascii="TT Norms Regular" w:hAnsi="TT Norms Regular"/>
+        <w:sz w:val="16"/>
+        <w:szCs w:val="16"/>
+      </w:rPr>
+      <w:t>Ravenscraig</w:t>
+    </w:r>
+    <w:proofErr w:type="spellEnd"/>
+    <w:r>
+      <w:rPr>
+        <w:rFonts w:ascii="TT Norms Regular" w:hAnsi="TT Norms Regular"/>
+        <w:sz w:val="16"/>
+        <w:szCs w:val="16"/>
+      </w:rPr>
+      <w:t xml:space="preserve"> Road, </w:t>
+    </w:r>
+    <w:proofErr w:type="gramStart"/>
+    <w:r>
+      <w:rPr>
+        <w:rFonts w:ascii="TT Norms Regular" w:hAnsi="TT Norms Regular"/>
+        <w:sz w:val="16"/>
+        <w:szCs w:val="16"/>
+      </w:rPr>
+      <w:t>Woodstock ,Unit</w:t>
+    </w:r>
+    <w:proofErr w:type="gramEnd"/>
+    <w:r>
+      <w:rPr>
+        <w:rFonts w:ascii="TT Norms Regular" w:hAnsi="TT Norms Regular"/>
+        <w:sz w:val="16"/>
+        <w:szCs w:val="16"/>
+      </w:rPr>
+      <w:t xml:space="preserve"> 116 Masons Press Building</w:t>
     </w:r>
   </w:p>
   <w:p>
@@ -1316,7 +1351,7 @@
         <w:szCs w:val="48"/>
       </w:rPr>
       <w:drawing>
-        <wp:anchor distT="0" distB="0" distL="114300" distR="114300" simplePos="0" relativeHeight="251658240" behindDoc="0" locked="0" layoutInCell="1" allowOverlap="1" wp14:anchorId="35AB9C5B" wp14:editId="1322E7BA">
+        <wp:anchor distT="0" distB="0" distL="114300" distR="114300" simplePos="0" relativeHeight="251657728" behindDoc="0" locked="0" layoutInCell="1" allowOverlap="1" wp14:anchorId="35AB9C5B" wp14:editId="1322E7BA">
           <wp:simplePos x="0" y="0"/>
           <wp:positionH relativeFrom="column">
             <wp:posOffset>5737860</wp:posOffset>
@@ -1478,7 +1513,7 @@
         </mc:Choice>
         <mc:Fallback>
           <w:pict>
-            <v:line w14:anchorId="6DADBA85" id="Straight Connector 2" o:spid="_x0000_s1026" style="flip:x;visibility:visible;mso-wrap-style:square;mso-left-percent:-10001;mso-top-percent:-10001;mso-position-horizontal:absolute;mso-position-horizontal-relative:char;mso-position-vertical:absolute;mso-position-vertical-relative:line;mso-left-percent:-10001;mso-top-percent:-10001" from="0,0" to="541.5pt,0" o:gfxdata="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" strokecolor="black [3200]" strokeweight="2pt">
+            <v:line w14:anchorId="248C126C" id="Straight Connector 2" o:spid="_x0000_s1026" style="flip:x;visibility:visible;mso-wrap-style:square;mso-left-percent:-10001;mso-top-percent:-10001;mso-position-horizontal:absolute;mso-position-horizontal-relative:char;mso-position-vertical:absolute;mso-position-vertical-relative:line;mso-left-percent:-10001;mso-top-percent:-10001" from="0,0" to="541.5pt,0" o:gfxdata="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" strokecolor="black [3200]" strokeweight="2pt">
               <v:shadow on="t" color="black" opacity="24903f" origin=",.5" offset="0,.55556mm"/>
               <w10:anchorlock/>
             </v:line>
@@ -2082,7 +2117,7 @@
   <w:style w:type="paragraph" w:default="1" w:styleId="Normal">
     <w:name w:val="Normal"/>
     <w:qFormat/>
-    <w:rsid w:val="00FC693F"/>
+    <w:rsid w:val="00490916"/>
     <w:rPr>
       <w:rFonts w:ascii="Arial" w:hAnsi="Arial"/>
       <w:sz w:val="20"/>

</xml_diff>